<commit_message>
Updated code for generating testcase documentation
</commit_message>
<xml_diff>
--- a/backend/app/tests/reports/testcase_documentation.docx
+++ b/backend/app/tests/reports/testcase_documentation.docx
@@ -12,12 +12,12 @@
     </w:p>
     <w:p>
       <w:r>
-        <w:t>Generated at: 2026-06-18T08:03:55+00:00</w:t>
+        <w:t>Generated at: 2026-06-19T07:37:49+00:00</w:t>
       </w:r>
     </w:p>
     <w:p>
       <w:r>
-        <w:t>Test session started: 2026-06-18T08:02:49+00:00</w:t>
+        <w:t>Test session started: 2026-06-19T07:36:13+00:00</w:t>
       </w:r>
     </w:p>
     <w:p>
@@ -348,7 +348,7 @@
           </w:tcPr>
           <w:p>
             <w:r>
-              <w:t>0.227</w:t>
+              <w:t>0.367</w:t>
             </w:r>
           </w:p>
         </w:tc>
@@ -420,7 +420,7 @@
           </w:tcPr>
           <w:p>
             <w:r>
-              <w:t>0.460</w:t>
+              <w:t>0.692</w:t>
             </w:r>
           </w:p>
         </w:tc>
@@ -492,7 +492,7 @@
           </w:tcPr>
           <w:p>
             <w:r>
-              <w:t>1.515</w:t>
+              <w:t>2.061</w:t>
             </w:r>
           </w:p>
         </w:tc>
@@ -564,7 +564,7 @@
           </w:tcPr>
           <w:p>
             <w:r>
-              <w:t>0.470</w:t>
+              <w:t>0.731</w:t>
             </w:r>
           </w:p>
         </w:tc>
@@ -636,7 +636,7 @@
           </w:tcPr>
           <w:p>
             <w:r>
-              <w:t>0.024</w:t>
+              <w:t>0.029</w:t>
             </w:r>
           </w:p>
         </w:tc>
@@ -708,7 +708,7 @@
           </w:tcPr>
           <w:p>
             <w:r>
-              <w:t>0.495</w:t>
+              <w:t>0.739</w:t>
             </w:r>
           </w:p>
         </w:tc>
@@ -780,7 +780,7 @@
           </w:tcPr>
           <w:p>
             <w:r>
-              <w:t>0.017</w:t>
+              <w:t>0.023</w:t>
             </w:r>
           </w:p>
         </w:tc>
@@ -852,7 +852,7 @@
           </w:tcPr>
           <w:p>
             <w:r>
-              <w:t>0.014</w:t>
+              <w:t>0.022</w:t>
             </w:r>
           </w:p>
         </w:tc>
@@ -924,7 +924,7 @@
           </w:tcPr>
           <w:p>
             <w:r>
-              <w:t>0.246</w:t>
+              <w:t>0.377</w:t>
             </w:r>
           </w:p>
         </w:tc>
@@ -996,7 +996,7 @@
           </w:tcPr>
           <w:p>
             <w:r>
-              <w:t>0.240</w:t>
+              <w:t>0.360</w:t>
             </w:r>
           </w:p>
         </w:tc>
@@ -1068,7 +1068,7 @@
           </w:tcPr>
           <w:p>
             <w:r>
-              <w:t>0.224</w:t>
+              <w:t>0.374</w:t>
             </w:r>
           </w:p>
         </w:tc>
@@ -1252,7 +1252,7 @@
           </w:tcPr>
           <w:p>
             <w:r>
-              <w:t>0.311</w:t>
+              <w:t>0.396</w:t>
             </w:r>
           </w:p>
         </w:tc>
@@ -1324,7 +1324,7 @@
           </w:tcPr>
           <w:p>
             <w:r>
-              <w:t>0.265</w:t>
+              <w:t>0.452</w:t>
             </w:r>
           </w:p>
         </w:tc>
@@ -1396,7 +1396,7 @@
           </w:tcPr>
           <w:p>
             <w:r>
-              <w:t>0.257</w:t>
+              <w:t>0.424</w:t>
             </w:r>
           </w:p>
         </w:tc>
@@ -1468,7 +1468,7 @@
           </w:tcPr>
           <w:p>
             <w:r>
-              <w:t>0.250</w:t>
+              <w:t>0.415</w:t>
             </w:r>
           </w:p>
         </w:tc>
@@ -1540,7 +1540,7 @@
           </w:tcPr>
           <w:p>
             <w:r>
-              <w:t>0.260</w:t>
+              <w:t>0.419</w:t>
             </w:r>
           </w:p>
         </w:tc>
@@ -1612,7 +1612,7 @@
           </w:tcPr>
           <w:p>
             <w:r>
-              <w:t>0.259</w:t>
+              <w:t>0.390</w:t>
             </w:r>
           </w:p>
         </w:tc>
@@ -1684,7 +1684,7 @@
           </w:tcPr>
           <w:p>
             <w:r>
-              <w:t>0.012</w:t>
+              <w:t>0.018</w:t>
             </w:r>
           </w:p>
         </w:tc>
@@ -1756,7 +1756,7 @@
           </w:tcPr>
           <w:p>
             <w:r>
-              <w:t>0.267</w:t>
+              <w:t>0.479</w:t>
             </w:r>
           </w:p>
         </w:tc>
@@ -1828,7 +1828,7 @@
           </w:tcPr>
           <w:p>
             <w:r>
-              <w:t>0.244</w:t>
+              <w:t>0.391</w:t>
             </w:r>
           </w:p>
         </w:tc>
@@ -1900,7 +1900,7 @@
           </w:tcPr>
           <w:p>
             <w:r>
-              <w:t>0.259</w:t>
+              <w:t>0.418</w:t>
             </w:r>
           </w:p>
         </w:tc>
@@ -1972,7 +1972,7 @@
           </w:tcPr>
           <w:p>
             <w:r>
-              <w:t>0.246</w:t>
+              <w:t>0.405</w:t>
             </w:r>
           </w:p>
         </w:tc>
@@ -2044,7 +2044,7 @@
           </w:tcPr>
           <w:p>
             <w:r>
-              <w:t>0.485</w:t>
+              <w:t>0.706</w:t>
             </w:r>
           </w:p>
         </w:tc>
@@ -2116,7 +2116,7 @@
           </w:tcPr>
           <w:p>
             <w:r>
-              <w:t>0.496</w:t>
+              <w:t>0.803</w:t>
             </w:r>
           </w:p>
         </w:tc>
@@ -2188,7 +2188,7 @@
           </w:tcPr>
           <w:p>
             <w:r>
-              <w:t>0.457</w:t>
+              <w:t>0.773</w:t>
             </w:r>
           </w:p>
         </w:tc>
@@ -2260,7 +2260,7 @@
           </w:tcPr>
           <w:p>
             <w:r>
-              <w:t>0.246</w:t>
+              <w:t>0.339</w:t>
             </w:r>
           </w:p>
         </w:tc>
@@ -2332,7 +2332,7 @@
           </w:tcPr>
           <w:p>
             <w:r>
-              <w:t>0.482</w:t>
+              <w:t>0.715</w:t>
             </w:r>
           </w:p>
         </w:tc>
@@ -2404,7 +2404,7 @@
           </w:tcPr>
           <w:p>
             <w:r>
-              <w:t>0.242</w:t>
+              <w:t>0.428</w:t>
             </w:r>
           </w:p>
         </w:tc>
@@ -2476,7 +2476,7 @@
           </w:tcPr>
           <w:p>
             <w:r>
-              <w:t>0.227</w:t>
+              <w:t>0.385</w:t>
             </w:r>
           </w:p>
         </w:tc>
@@ -2548,7 +2548,7 @@
           </w:tcPr>
           <w:p>
             <w:r>
-              <w:t>0.244</w:t>
+              <w:t>0.368</w:t>
             </w:r>
           </w:p>
         </w:tc>
@@ -2620,7 +2620,7 @@
           </w:tcPr>
           <w:p>
             <w:r>
-              <w:t>0.499</w:t>
+              <w:t>0.839</w:t>
             </w:r>
           </w:p>
         </w:tc>
@@ -2692,7 +2692,7 @@
           </w:tcPr>
           <w:p>
             <w:r>
-              <w:t>0.455</w:t>
+              <w:t>0.703</w:t>
             </w:r>
           </w:p>
         </w:tc>
@@ -2764,7 +2764,7 @@
           </w:tcPr>
           <w:p>
             <w:r>
-              <w:t>0.492</w:t>
+              <w:t>0.856</w:t>
             </w:r>
           </w:p>
         </w:tc>
@@ -2948,7 +2948,7 @@
           </w:tcPr>
           <w:p>
             <w:r>
-              <w:t>0.234</w:t>
+              <w:t>0.405</w:t>
             </w:r>
           </w:p>
         </w:tc>
@@ -3020,7 +3020,7 @@
           </w:tcPr>
           <w:p>
             <w:r>
-              <w:t>12.517</w:t>
+              <w:t>12.847</w:t>
             </w:r>
           </w:p>
         </w:tc>
@@ -3092,7 +3092,7 @@
           </w:tcPr>
           <w:p>
             <w:r>
-              <w:t>0.226</w:t>
+              <w:t>0.470</w:t>
             </w:r>
           </w:p>
         </w:tc>
@@ -3164,7 +3164,7 @@
           </w:tcPr>
           <w:p>
             <w:r>
-              <w:t>0.467</w:t>
+              <w:t>0.821</w:t>
             </w:r>
           </w:p>
         </w:tc>
@@ -3236,7 +3236,7 @@
           </w:tcPr>
           <w:p>
             <w:r>
-              <w:t>0.013</w:t>
+              <w:t>0.025</w:t>
             </w:r>
           </w:p>
         </w:tc>
@@ -3308,7 +3308,7 @@
           </w:tcPr>
           <w:p>
             <w:r>
-              <w:t>0.237</w:t>
+              <w:t>0.437</w:t>
             </w:r>
           </w:p>
         </w:tc>
@@ -3380,7 +3380,7 @@
           </w:tcPr>
           <w:p>
             <w:r>
-              <w:t>0.232</w:t>
+              <w:t>0.396</w:t>
             </w:r>
           </w:p>
         </w:tc>
@@ -3452,7 +3452,7 @@
           </w:tcPr>
           <w:p>
             <w:r>
-              <w:t>0.235</w:t>
+              <w:t>0.348</w:t>
             </w:r>
           </w:p>
         </w:tc>
@@ -3524,7 +3524,7 @@
           </w:tcPr>
           <w:p>
             <w:r>
-              <w:t>0.226</w:t>
+              <w:t>0.412</w:t>
             </w:r>
           </w:p>
         </w:tc>
@@ -3596,7 +3596,7 @@
           </w:tcPr>
           <w:p>
             <w:r>
-              <w:t>0.012</w:t>
+              <w:t>0.026</w:t>
             </w:r>
           </w:p>
         </w:tc>
@@ -3668,7 +3668,7 @@
           </w:tcPr>
           <w:p>
             <w:r>
-              <w:t>0.012</w:t>
+              <w:t>0.028</w:t>
             </w:r>
           </w:p>
         </w:tc>
@@ -3740,7 +3740,7 @@
           </w:tcPr>
           <w:p>
             <w:r>
-              <w:t>0.247</w:t>
+              <w:t>0.321</w:t>
             </w:r>
           </w:p>
         </w:tc>
@@ -3812,7 +3812,7 @@
           </w:tcPr>
           <w:p>
             <w:r>
-              <w:t>0.237</w:t>
+              <w:t>0.344</w:t>
             </w:r>
           </w:p>
         </w:tc>
@@ -3884,7 +3884,7 @@
           </w:tcPr>
           <w:p>
             <w:r>
-              <w:t>0.241</w:t>
+              <w:t>0.359</w:t>
             </w:r>
           </w:p>
         </w:tc>
@@ -3956,7 +3956,7 @@
           </w:tcPr>
           <w:p>
             <w:r>
-              <w:t>0.235</w:t>
+              <w:t>0.357</w:t>
             </w:r>
           </w:p>
         </w:tc>
@@ -4028,7 +4028,7 @@
           </w:tcPr>
           <w:p>
             <w:r>
-              <w:t>0.488</w:t>
+              <w:t>0.725</w:t>
             </w:r>
           </w:p>
         </w:tc>
@@ -4100,7 +4100,7 @@
           </w:tcPr>
           <w:p>
             <w:r>
-              <w:t>0.016</w:t>
+              <w:t>0.023</w:t>
             </w:r>
           </w:p>
         </w:tc>
@@ -4172,7 +4172,7 @@
           </w:tcPr>
           <w:p>
             <w:r>
-              <w:t>0.227</w:t>
+              <w:t>0.363</w:t>
             </w:r>
           </w:p>
         </w:tc>
@@ -4244,7 +4244,7 @@
           </w:tcPr>
           <w:p>
             <w:r>
-              <w:t>0.236</w:t>
+              <w:t>0.344</w:t>
             </w:r>
           </w:p>
         </w:tc>
@@ -4316,7 +4316,7 @@
           </w:tcPr>
           <w:p>
             <w:r>
-              <w:t>0.230</w:t>
+              <w:t>0.367</w:t>
             </w:r>
           </w:p>
         </w:tc>
@@ -4388,7 +4388,7 @@
           </w:tcPr>
           <w:p>
             <w:r>
-              <w:t>0.239</w:t>
+              <w:t>0.365</w:t>
             </w:r>
           </w:p>
         </w:tc>
@@ -4460,7 +4460,7 @@
           </w:tcPr>
           <w:p>
             <w:r>
-              <w:t>0.226</w:t>
+              <w:t>0.415</w:t>
             </w:r>
           </w:p>
         </w:tc>
@@ -4532,7 +4532,7 @@
           </w:tcPr>
           <w:p>
             <w:r>
-              <w:t>0.010</w:t>
+              <w:t>0.022</w:t>
             </w:r>
           </w:p>
         </w:tc>
@@ -4604,7 +4604,7 @@
           </w:tcPr>
           <w:p>
             <w:r>
-              <w:t>0.020</w:t>
+              <w:t>0.028</w:t>
             </w:r>
           </w:p>
         </w:tc>
@@ -4788,7 +4788,7 @@
           </w:tcPr>
           <w:p>
             <w:r>
-              <w:t>0.011</w:t>
+              <w:t>0.020</w:t>
             </w:r>
           </w:p>
         </w:tc>
@@ -4860,7 +4860,7 @@
           </w:tcPr>
           <w:p>
             <w:r>
-              <w:t>0.481</w:t>
+              <w:t>0.801</w:t>
             </w:r>
           </w:p>
         </w:tc>
@@ -4932,7 +4932,7 @@
           </w:tcPr>
           <w:p>
             <w:r>
-              <w:t>0.239</w:t>
+              <w:t>0.319</w:t>
             </w:r>
           </w:p>
         </w:tc>
@@ -5004,7 +5004,7 @@
           </w:tcPr>
           <w:p>
             <w:r>
-              <w:t>0.467</w:t>
+              <w:t>0.694</w:t>
             </w:r>
           </w:p>
         </w:tc>
@@ -5076,7 +5076,7 @@
           </w:tcPr>
           <w:p>
             <w:r>
-              <w:t>0.479</w:t>
+              <w:t>0.758</w:t>
             </w:r>
           </w:p>
         </w:tc>
@@ -5148,7 +5148,7 @@
           </w:tcPr>
           <w:p>
             <w:r>
-              <w:t>0.521</w:t>
+              <w:t>0.735</w:t>
             </w:r>
           </w:p>
         </w:tc>
@@ -5220,7 +5220,7 @@
           </w:tcPr>
           <w:p>
             <w:r>
-              <w:t>0.479</w:t>
+              <w:t>0.752</w:t>
             </w:r>
           </w:p>
         </w:tc>
@@ -5292,7 +5292,7 @@
           </w:tcPr>
           <w:p>
             <w:r>
-              <w:t>0.478</w:t>
+              <w:t>0.744</w:t>
             </w:r>
           </w:p>
         </w:tc>
@@ -5364,7 +5364,7 @@
           </w:tcPr>
           <w:p>
             <w:r>
-              <w:t>0.244</w:t>
+              <w:t>0.398</w:t>
             </w:r>
           </w:p>
         </w:tc>
@@ -5436,7 +5436,7 @@
           </w:tcPr>
           <w:p>
             <w:r>
-              <w:t>0.254</w:t>
+              <w:t>0.378</w:t>
             </w:r>
           </w:p>
         </w:tc>
@@ -5508,7 +5508,7 @@
           </w:tcPr>
           <w:p>
             <w:r>
-              <w:t>0.253</w:t>
+              <w:t>0.362</w:t>
             </w:r>
           </w:p>
         </w:tc>
@@ -5580,7 +5580,7 @@
           </w:tcPr>
           <w:p>
             <w:r>
-              <w:t>0.249</w:t>
+              <w:t>0.356</w:t>
             </w:r>
           </w:p>
         </w:tc>
@@ -5652,7 +5652,7 @@
           </w:tcPr>
           <w:p>
             <w:r>
-              <w:t>0.242</w:t>
+              <w:t>0.368</w:t>
             </w:r>
           </w:p>
         </w:tc>
@@ -5724,7 +5724,7 @@
           </w:tcPr>
           <w:p>
             <w:r>
-              <w:t>0.461</w:t>
+              <w:t>0.673</w:t>
             </w:r>
           </w:p>
         </w:tc>
@@ -5908,7 +5908,7 @@
           </w:tcPr>
           <w:p>
             <w:r>
-              <w:t>0.238</w:t>
+              <w:t>0.378</w:t>
             </w:r>
           </w:p>
         </w:tc>
@@ -5980,7 +5980,7 @@
           </w:tcPr>
           <w:p>
             <w:r>
-              <w:t>0.251</w:t>
+              <w:t>0.406</w:t>
             </w:r>
           </w:p>
         </w:tc>
@@ -6052,7 +6052,7 @@
           </w:tcPr>
           <w:p>
             <w:r>
-              <w:t>0.252</w:t>
+              <w:t>0.331</w:t>
             </w:r>
           </w:p>
         </w:tc>
@@ -6124,7 +6124,7 @@
           </w:tcPr>
           <w:p>
             <w:r>
-              <w:t>0.223</w:t>
+              <w:t>0.348</w:t>
             </w:r>
           </w:p>
         </w:tc>
@@ -6196,7 +6196,7 @@
           </w:tcPr>
           <w:p>
             <w:r>
-              <w:t>0.258</w:t>
+              <w:t>0.366</w:t>
             </w:r>
           </w:p>
         </w:tc>
@@ -6268,7 +6268,7 @@
           </w:tcPr>
           <w:p>
             <w:r>
-              <w:t>0.239</w:t>
+              <w:t>0.391</w:t>
             </w:r>
           </w:p>
         </w:tc>
@@ -6340,7 +6340,7 @@
           </w:tcPr>
           <w:p>
             <w:r>
-              <w:t>0.014</w:t>
+              <w:t>0.029</w:t>
             </w:r>
           </w:p>
         </w:tc>
@@ -6412,7 +6412,7 @@
           </w:tcPr>
           <w:p>
             <w:r>
-              <w:t>0.475</w:t>
+              <w:t>0.635</w:t>
             </w:r>
           </w:p>
         </w:tc>
@@ -6484,7 +6484,7 @@
           </w:tcPr>
           <w:p>
             <w:r>
-              <w:t>0.225</w:t>
+              <w:t>0.387</w:t>
             </w:r>
           </w:p>
         </w:tc>
@@ -6556,7 +6556,7 @@
           </w:tcPr>
           <w:p>
             <w:r>
-              <w:t>0.467</w:t>
+              <w:t>0.713</w:t>
             </w:r>
           </w:p>
         </w:tc>
@@ -6628,7 +6628,7 @@
           </w:tcPr>
           <w:p>
             <w:r>
-              <w:t>0.232</w:t>
+              <w:t>0.353</w:t>
             </w:r>
           </w:p>
         </w:tc>
@@ -6700,7 +6700,7 @@
           </w:tcPr>
           <w:p>
             <w:r>
-              <w:t>0.244</w:t>
+              <w:t>0.408</w:t>
             </w:r>
           </w:p>
         </w:tc>
@@ -6772,7 +6772,7 @@
           </w:tcPr>
           <w:p>
             <w:r>
-              <w:t>0.465</w:t>
+              <w:t>0.661</w:t>
             </w:r>
           </w:p>
         </w:tc>
@@ -6844,7 +6844,7 @@
           </w:tcPr>
           <w:p>
             <w:r>
-              <w:t>0.228</w:t>
+              <w:t>0.456</w:t>
             </w:r>
           </w:p>
         </w:tc>
@@ -6916,7 +6916,7 @@
           </w:tcPr>
           <w:p>
             <w:r>
-              <w:t>0.459</w:t>
+              <w:t>0.679</w:t>
             </w:r>
           </w:p>
         </w:tc>
@@ -7100,7 +7100,7 @@
           </w:tcPr>
           <w:p>
             <w:r>
-              <w:t>0.503</w:t>
+              <w:t>0.775</w:t>
             </w:r>
           </w:p>
         </w:tc>
@@ -7172,7 +7172,7 @@
           </w:tcPr>
           <w:p>
             <w:r>
-              <w:t>0.463</w:t>
+              <w:t>0.762</w:t>
             </w:r>
           </w:p>
         </w:tc>
@@ -7244,7 +7244,7 @@
           </w:tcPr>
           <w:p>
             <w:r>
-              <w:t>0.486</w:t>
+              <w:t>0.724</w:t>
             </w:r>
           </w:p>
         </w:tc>
@@ -7316,7 +7316,7 @@
           </w:tcPr>
           <w:p>
             <w:r>
-              <w:t>0.462</w:t>
+              <w:t>0.639</w:t>
             </w:r>
           </w:p>
         </w:tc>
@@ -7388,7 +7388,7 @@
           </w:tcPr>
           <w:p>
             <w:r>
-              <w:t>0.234</w:t>
+              <w:t>0.360</w:t>
             </w:r>
           </w:p>
         </w:tc>
@@ -7460,7 +7460,7 @@
           </w:tcPr>
           <w:p>
             <w:r>
-              <w:t>0.009</w:t>
+              <w:t>0.019</w:t>
             </w:r>
           </w:p>
         </w:tc>
@@ -7532,7 +7532,7 @@
           </w:tcPr>
           <w:p>
             <w:r>
-              <w:t>0.010</w:t>
+              <w:t>0.021</w:t>
             </w:r>
           </w:p>
         </w:tc>
@@ -7604,7 +7604,7 @@
           </w:tcPr>
           <w:p>
             <w:r>
-              <w:t>0.460</w:t>
+              <w:t>0.693</w:t>
             </w:r>
           </w:p>
         </w:tc>
@@ -7676,7 +7676,7 @@
           </w:tcPr>
           <w:p>
             <w:r>
-              <w:t>0.465</w:t>
+              <w:t>0.719</w:t>
             </w:r>
           </w:p>
         </w:tc>
@@ -7748,7 +7748,7 @@
           </w:tcPr>
           <w:p>
             <w:r>
-              <w:t>0.235</w:t>
+              <w:t>0.338</w:t>
             </w:r>
           </w:p>
         </w:tc>
@@ -7820,7 +7820,7 @@
           </w:tcPr>
           <w:p>
             <w:r>
-              <w:t>0.241</w:t>
+              <w:t>0.368</w:t>
             </w:r>
           </w:p>
         </w:tc>
@@ -7892,7 +7892,7 @@
           </w:tcPr>
           <w:p>
             <w:r>
-              <w:t>0.468</w:t>
+              <w:t>0.783</w:t>
             </w:r>
           </w:p>
         </w:tc>
@@ -7964,7 +7964,7 @@
           </w:tcPr>
           <w:p>
             <w:r>
-              <w:t>0.239</w:t>
+              <w:t>0.367</w:t>
             </w:r>
           </w:p>
         </w:tc>
@@ -8036,7 +8036,7 @@
           </w:tcPr>
           <w:p>
             <w:r>
-              <w:t>0.465</w:t>
+              <w:t>0.747</w:t>
             </w:r>
           </w:p>
         </w:tc>
@@ -8108,7 +8108,7 @@
           </w:tcPr>
           <w:p>
             <w:r>
-              <w:t>0.461</w:t>
+              <w:t>0.754</w:t>
             </w:r>
           </w:p>
         </w:tc>
@@ -8180,7 +8180,7 @@
           </w:tcPr>
           <w:p>
             <w:r>
-              <w:t>0.228</w:t>
+              <w:t>0.411</w:t>
             </w:r>
           </w:p>
         </w:tc>
@@ -8252,7 +8252,7 @@
           </w:tcPr>
           <w:p>
             <w:r>
-              <w:t>0.235</w:t>
+              <w:t>0.369</w:t>
             </w:r>
           </w:p>
         </w:tc>
@@ -8436,7 +8436,7 @@
           </w:tcPr>
           <w:p>
             <w:r>
-              <w:t>0.246</w:t>
+              <w:t>0.396</w:t>
             </w:r>
           </w:p>
         </w:tc>
@@ -8508,7 +8508,7 @@
           </w:tcPr>
           <w:p>
             <w:r>
-              <w:t>0.269</w:t>
+              <w:t>0.365</w:t>
             </w:r>
           </w:p>
         </w:tc>
@@ -8580,7 +8580,7 @@
           </w:tcPr>
           <w:p>
             <w:r>
-              <w:t>0.247</w:t>
+              <w:t>0.395</w:t>
             </w:r>
           </w:p>
         </w:tc>
@@ -8652,7 +8652,7 @@
           </w:tcPr>
           <w:p>
             <w:r>
-              <w:t>0.466</w:t>
+              <w:t>0.775</w:t>
             </w:r>
           </w:p>
         </w:tc>
@@ -8724,7 +8724,7 @@
           </w:tcPr>
           <w:p>
             <w:r>
-              <w:t>0.247</w:t>
+              <w:t>0.449</w:t>
             </w:r>
           </w:p>
         </w:tc>
@@ -8796,7 +8796,7 @@
           </w:tcPr>
           <w:p>
             <w:r>
-              <w:t>0.234</w:t>
+              <w:t>0.406</w:t>
             </w:r>
           </w:p>
         </w:tc>
@@ -8868,7 +8868,7 @@
           </w:tcPr>
           <w:p>
             <w:r>
-              <w:t>0.463</w:t>
+              <w:t>0.694</w:t>
             </w:r>
           </w:p>
         </w:tc>
@@ -8940,7 +8940,7 @@
           </w:tcPr>
           <w:p>
             <w:r>
-              <w:t>0.484</w:t>
+              <w:t>0.843</w:t>
             </w:r>
           </w:p>
         </w:tc>
@@ -9012,7 +9012,7 @@
           </w:tcPr>
           <w:p>
             <w:r>
-              <w:t>0.232</w:t>
+              <w:t>0.360</w:t>
             </w:r>
           </w:p>
         </w:tc>
@@ -9084,7 +9084,7 @@
           </w:tcPr>
           <w:p>
             <w:r>
-              <w:t>0.508</w:t>
+              <w:t>0.751</w:t>
             </w:r>
           </w:p>
         </w:tc>
@@ -9156,7 +9156,7 @@
           </w:tcPr>
           <w:p>
             <w:r>
-              <w:t>0.523</w:t>
+              <w:t>0.772</w:t>
             </w:r>
           </w:p>
         </w:tc>
@@ -9228,7 +9228,7 @@
           </w:tcPr>
           <w:p>
             <w:r>
-              <w:t>0.467</w:t>
+              <w:t>0.805</w:t>
             </w:r>
           </w:p>
         </w:tc>
@@ -9300,7 +9300,7 @@
           </w:tcPr>
           <w:p>
             <w:r>
-              <w:t>0.265</w:t>
+              <w:t>0.405</w:t>
             </w:r>
           </w:p>
         </w:tc>
@@ -9372,7 +9372,7 @@
           </w:tcPr>
           <w:p>
             <w:r>
-              <w:t>0.473</w:t>
+              <w:t>0.797</w:t>
             </w:r>
           </w:p>
         </w:tc>
@@ -9444,7 +9444,7 @@
           </w:tcPr>
           <w:p>
             <w:r>
-              <w:t>0.240</w:t>
+              <w:t>0.363</w:t>
             </w:r>
           </w:p>
         </w:tc>
@@ -9516,7 +9516,7 @@
           </w:tcPr>
           <w:p>
             <w:r>
-              <w:t>0.250</w:t>
+              <w:t>0.358</w:t>
             </w:r>
           </w:p>
         </w:tc>
@@ -9588,7 +9588,7 @@
           </w:tcPr>
           <w:p>
             <w:r>
-              <w:t>0.243</w:t>
+              <w:t>0.370</w:t>
             </w:r>
           </w:p>
         </w:tc>
@@ -9660,7 +9660,7 @@
           </w:tcPr>
           <w:p>
             <w:r>
-              <w:t>0.222</w:t>
+              <w:t>0.388</w:t>
             </w:r>
           </w:p>
         </w:tc>
@@ -9732,7 +9732,7 @@
           </w:tcPr>
           <w:p>
             <w:r>
-              <w:t>0.247</w:t>
+              <w:t>0.368</w:t>
             </w:r>
           </w:p>
         </w:tc>
@@ -9804,7 +9804,7 @@
           </w:tcPr>
           <w:p>
             <w:r>
-              <w:t>0.233</w:t>
+              <w:t>0.332</w:t>
             </w:r>
           </w:p>
         </w:tc>
@@ -9876,7 +9876,7 @@
           </w:tcPr>
           <w:p>
             <w:r>
-              <w:t>0.461</w:t>
+              <w:t>0.791</w:t>
             </w:r>
           </w:p>
         </w:tc>
@@ -10060,7 +10060,7 @@
           </w:tcPr>
           <w:p>
             <w:r>
-              <w:t>0.254</w:t>
+              <w:t>0.418</w:t>
             </w:r>
           </w:p>
         </w:tc>
@@ -10132,7 +10132,7 @@
           </w:tcPr>
           <w:p>
             <w:r>
-              <w:t>0.262</w:t>
+              <w:t>0.390</w:t>
             </w:r>
           </w:p>
         </w:tc>
@@ -10204,7 +10204,7 @@
           </w:tcPr>
           <w:p>
             <w:r>
-              <w:t>0.238</w:t>
+              <w:t>0.321</w:t>
             </w:r>
           </w:p>
         </w:tc>
@@ -10276,7 +10276,7 @@
           </w:tcPr>
           <w:p>
             <w:r>
-              <w:t>0.247</w:t>
+              <w:t>0.396</w:t>
             </w:r>
           </w:p>
         </w:tc>
@@ -10348,7 +10348,7 @@
           </w:tcPr>
           <w:p>
             <w:r>
-              <w:t>0.237</w:t>
+              <w:t>0.396</w:t>
             </w:r>
           </w:p>
         </w:tc>
@@ -10420,7 +10420,7 @@
           </w:tcPr>
           <w:p>
             <w:r>
-              <w:t>0.259</w:t>
+              <w:t>0.414</w:t>
             </w:r>
           </w:p>
         </w:tc>
@@ -10492,7 +10492,7 @@
           </w:tcPr>
           <w:p>
             <w:r>
-              <w:t>0.235</w:t>
+              <w:t>0.342</w:t>
             </w:r>
           </w:p>
         </w:tc>
@@ -10564,7 +10564,7 @@
           </w:tcPr>
           <w:p>
             <w:r>
-              <w:t>0.259</w:t>
+              <w:t>0.376</w:t>
             </w:r>
           </w:p>
         </w:tc>
@@ -10636,7 +10636,7 @@
           </w:tcPr>
           <w:p>
             <w:r>
-              <w:t>0.457</w:t>
+              <w:t>0.699</w:t>
             </w:r>
           </w:p>
         </w:tc>
@@ -10708,7 +10708,7 @@
           </w:tcPr>
           <w:p>
             <w:r>
-              <w:t>0.241</w:t>
+              <w:t>0.348</w:t>
             </w:r>
           </w:p>
         </w:tc>
@@ -10780,7 +10780,7 @@
           </w:tcPr>
           <w:p>
             <w:r>
-              <w:t>0.480</w:t>
+              <w:t>0.697</w:t>
             </w:r>
           </w:p>
         </w:tc>
@@ -10852,7 +10852,7 @@
           </w:tcPr>
           <w:p>
             <w:r>
-              <w:t>0.244</w:t>
+              <w:t>0.334</w:t>
             </w:r>
           </w:p>
         </w:tc>
@@ -10924,7 +10924,7 @@
           </w:tcPr>
           <w:p>
             <w:r>
-              <w:t>0.498</w:t>
+              <w:t>0.677</w:t>
             </w:r>
           </w:p>
         </w:tc>
@@ -10996,7 +10996,7 @@
           </w:tcPr>
           <w:p>
             <w:r>
-              <w:t>0.466</w:t>
+              <w:t>0.651</w:t>
             </w:r>
           </w:p>
         </w:tc>
@@ -11068,7 +11068,7 @@
           </w:tcPr>
           <w:p>
             <w:r>
-              <w:t>0.254</w:t>
+              <w:t>0.400</w:t>
             </w:r>
           </w:p>
         </w:tc>
@@ -11140,7 +11140,7 @@
           </w:tcPr>
           <w:p>
             <w:r>
-              <w:t>0.244</w:t>
+              <w:t>0.398</w:t>
             </w:r>
           </w:p>
         </w:tc>
@@ -11212,7 +11212,7 @@
           </w:tcPr>
           <w:p>
             <w:r>
-              <w:t>0.238</w:t>
+              <w:t>0.364</w:t>
             </w:r>
           </w:p>
         </w:tc>
@@ -11284,7 +11284,7 @@
           </w:tcPr>
           <w:p>
             <w:r>
-              <w:t>0.481</w:t>
+              <w:t>1.005</w:t>
             </w:r>
           </w:p>
         </w:tc>
@@ -11356,7 +11356,7 @@
           </w:tcPr>
           <w:p>
             <w:r>
-              <w:t>0.225</w:t>
+              <w:t>0.343</w:t>
             </w:r>
           </w:p>
         </w:tc>
@@ -11428,7 +11428,7 @@
           </w:tcPr>
           <w:p>
             <w:r>
-              <w:t>0.488</w:t>
+              <w:t>0.719</w:t>
             </w:r>
           </w:p>
         </w:tc>
@@ -11612,7 +11612,7 @@
           </w:tcPr>
           <w:p>
             <w:r>
-              <w:t>0.239</w:t>
+              <w:t>0.377</w:t>
             </w:r>
           </w:p>
         </w:tc>
@@ -11684,7 +11684,7 @@
           </w:tcPr>
           <w:p>
             <w:r>
-              <w:t>0.011</w:t>
+              <w:t>0.029</w:t>
             </w:r>
           </w:p>
         </w:tc>
@@ -11756,7 +11756,7 @@
           </w:tcPr>
           <w:p>
             <w:r>
-              <w:t>0.235</w:t>
+              <w:t>0.388</w:t>
             </w:r>
           </w:p>
         </w:tc>
@@ -11828,7 +11828,7 @@
           </w:tcPr>
           <w:p>
             <w:r>
-              <w:t>0.237</w:t>
+              <w:t>0.412</w:t>
             </w:r>
           </w:p>
         </w:tc>
@@ -11900,7 +11900,7 @@
           </w:tcPr>
           <w:p>
             <w:r>
-              <w:t>0.237</w:t>
+              <w:t>0.518</w:t>
             </w:r>
           </w:p>
         </w:tc>
@@ -11972,7 +11972,7 @@
           </w:tcPr>
           <w:p>
             <w:r>
-              <w:t>0.008</w:t>
+              <w:t>0.021</w:t>
             </w:r>
           </w:p>
         </w:tc>
@@ -12044,7 +12044,7 @@
           </w:tcPr>
           <w:p>
             <w:r>
-              <w:t>0.239</w:t>
+              <w:t>0.349</w:t>
             </w:r>
           </w:p>
         </w:tc>
@@ -12116,7 +12116,7 @@
           </w:tcPr>
           <w:p>
             <w:r>
-              <w:t>0.231</w:t>
+              <w:t>0.413</w:t>
             </w:r>
           </w:p>
         </w:tc>
@@ -12188,7 +12188,7 @@
           </w:tcPr>
           <w:p>
             <w:r>
-              <w:t>0.230</w:t>
+              <w:t>0.379</w:t>
             </w:r>
           </w:p>
         </w:tc>
@@ -12260,7 +12260,7 @@
           </w:tcPr>
           <w:p>
             <w:r>
-              <w:t>0.007</w:t>
+              <w:t>0.014</w:t>
             </w:r>
           </w:p>
         </w:tc>
@@ -12332,7 +12332,7 @@
           </w:tcPr>
           <w:p>
             <w:r>
-              <w:t>0.241</w:t>
+              <w:t>0.349</w:t>
             </w:r>
           </w:p>
         </w:tc>
@@ -12404,7 +12404,7 @@
           </w:tcPr>
           <w:p>
             <w:r>
-              <w:t>0.443</w:t>
+              <w:t>0.689</w:t>
             </w:r>
           </w:p>
         </w:tc>
@@ -12476,7 +12476,7 @@
           </w:tcPr>
           <w:p>
             <w:r>
-              <w:t>0.237</w:t>
+              <w:t>0.355</w:t>
             </w:r>
           </w:p>
         </w:tc>
@@ -12548,7 +12548,7 @@
           </w:tcPr>
           <w:p>
             <w:r>
-              <w:t>0.011</w:t>
+              <w:t>0.023</w:t>
             </w:r>
           </w:p>
         </w:tc>
@@ -12620,7 +12620,7 @@
           </w:tcPr>
           <w:p>
             <w:r>
-              <w:t>0.226</w:t>
+              <w:t>0.447</w:t>
             </w:r>
           </w:p>
         </w:tc>
@@ -12804,7 +12804,7 @@
           </w:tcPr>
           <w:p>
             <w:r>
-              <w:t>0.011</w:t>
+              <w:t>0.024</w:t>
             </w:r>
           </w:p>
         </w:tc>
@@ -12876,7 +12876,7 @@
           </w:tcPr>
           <w:p>
             <w:r>
-              <w:t>0.010</w:t>
+              <w:t>0.019</w:t>
             </w:r>
           </w:p>
         </w:tc>
@@ -12948,7 +12948,7 @@
           </w:tcPr>
           <w:p>
             <w:r>
-              <w:t>0.013</w:t>
+              <w:t>0.023</w:t>
             </w:r>
           </w:p>
         </w:tc>
@@ -13132,7 +13132,7 @@
           </w:tcPr>
           <w:p>
             <w:r>
-              <w:t>0.246</w:t>
+              <w:t>0.466</w:t>
             </w:r>
           </w:p>
         </w:tc>
@@ -13204,7 +13204,7 @@
           </w:tcPr>
           <w:p>
             <w:r>
-              <w:t>0.274</w:t>
+              <w:t>0.433</w:t>
             </w:r>
           </w:p>
         </w:tc>
@@ -13276,7 +13276,7 @@
           </w:tcPr>
           <w:p>
             <w:r>
-              <w:t>0.257</w:t>
+              <w:t>0.438</w:t>
             </w:r>
           </w:p>
         </w:tc>
@@ -13348,7 +13348,7 @@
           </w:tcPr>
           <w:p>
             <w:r>
-              <w:t>0.240</w:t>
+              <w:t>0.403</w:t>
             </w:r>
           </w:p>
         </w:tc>
@@ -13420,7 +13420,7 @@
           </w:tcPr>
           <w:p>
             <w:r>
-              <w:t>0.255</w:t>
+              <w:t>0.393</w:t>
             </w:r>
           </w:p>
         </w:tc>
@@ -13492,7 +13492,7 @@
           </w:tcPr>
           <w:p>
             <w:r>
-              <w:t>0.240</w:t>
+              <w:t>0.378</w:t>
             </w:r>
           </w:p>
         </w:tc>
@@ -13564,7 +13564,7 @@
           </w:tcPr>
           <w:p>
             <w:r>
-              <w:t>0.494</w:t>
+              <w:t>0.767</w:t>
             </w:r>
           </w:p>
         </w:tc>
@@ -13636,7 +13636,7 @@
           </w:tcPr>
           <w:p>
             <w:r>
-              <w:t>0.283</w:t>
+              <w:t>0.350</w:t>
             </w:r>
           </w:p>
         </w:tc>
@@ -13708,7 +13708,7 @@
           </w:tcPr>
           <w:p>
             <w:r>
-              <w:t>0.469</w:t>
+              <w:t>0.765</w:t>
             </w:r>
           </w:p>
         </w:tc>
@@ -13780,7 +13780,7 @@
           </w:tcPr>
           <w:p>
             <w:r>
-              <w:t>0.265</w:t>
+              <w:t>0.483</w:t>
             </w:r>
           </w:p>
         </w:tc>
@@ -13852,7 +13852,7 @@
           </w:tcPr>
           <w:p>
             <w:r>
-              <w:t>0.244</w:t>
+              <w:t>0.422</w:t>
             </w:r>
           </w:p>
         </w:tc>
@@ -13924,7 +13924,7 @@
           </w:tcPr>
           <w:p>
             <w:r>
-              <w:t>0.481</w:t>
+              <w:t>0.858</w:t>
             </w:r>
           </w:p>
         </w:tc>
@@ -13996,7 +13996,7 @@
           </w:tcPr>
           <w:p>
             <w:r>
-              <w:t>0.501</w:t>
+              <w:t>0.778</w:t>
             </w:r>
           </w:p>
         </w:tc>
@@ -14068,7 +14068,7 @@
           </w:tcPr>
           <w:p>
             <w:r>
-              <w:t>0.011</w:t>
+              <w:t>0.018</w:t>
             </w:r>
           </w:p>
         </w:tc>
@@ -14140,7 +14140,7 @@
           </w:tcPr>
           <w:p>
             <w:r>
-              <w:t>0.465</w:t>
+              <w:t>0.699</w:t>
             </w:r>
           </w:p>
         </w:tc>
@@ -14212,7 +14212,7 @@
           </w:tcPr>
           <w:p>
             <w:r>
-              <w:t>0.231</w:t>
+              <w:t>0.359</w:t>
             </w:r>
           </w:p>
         </w:tc>
@@ -14284,7 +14284,7 @@
           </w:tcPr>
           <w:p>
             <w:r>
-              <w:t>0.475</w:t>
+              <w:t>0.783</w:t>
             </w:r>
           </w:p>
         </w:tc>

</xml_diff>